<commit_message>
Update Period-3 lesson script: detailed teacher lines, 停跑說 3-step
</commit_message>
<xml_diff>
--- a/冰淇淋邊界大冒險_第三節教案逐字稿.docx
+++ b/冰淇淋邊界大冒險_第三節教案逐字稿.docx
@@ -13,7 +13,7 @@
           <w:color w:val="C0392B"/>
           <w:sz w:val="36"/>
         </w:rPr>
-        <w:t>🍦 冰淇淋邊界大冒險 ｜ 第三節教學逐字稿</w:t>
+        <w:t>🍦 冰淇淋邊界大冒險 ｜ 第三節教學逐字稿（詳細版）</w:t>
       </w:r>
     </w:p>
     <w:p>
@@ -27,13 +27,10 @@
           <w:color w:val="555555"/>
           <w:sz w:val="22"/>
         </w:rPr>
-        <w:t>國中特教班・社會科｜45 分鐘｜主題：身體界線・身體自主權</w:t>
+        <w:t>國中特教班・社會科｜45 分鐘｜身體界線・身體自主權</w:t>
       </w:r>
     </w:p>
     <w:p>
-      <w:pPr>
-        <w:ind w:left="144"/>
-      </w:pPr>
       <w:r>
         <w:rPr>
           <w:rFonts w:ascii="Microsoft JhengHei" w:hAnsi="Microsoft JhengHei" w:eastAsia="Microsoft JhengHei"/>
@@ -45,16 +42,13 @@
       </w:r>
     </w:p>
     <w:p>
-      <w:pPr>
-        <w:ind w:left="144"/>
-      </w:pPr>
       <w:r>
         <w:rPr>
           <w:rFonts w:ascii="Microsoft JhengHei" w:hAnsi="Microsoft JhengHei" w:eastAsia="Microsoft JhengHei"/>
           <w:b w:val="0"/>
           <w:sz w:val="24"/>
         </w:rPr>
-        <w:t>「我準備得很充分，今天只要陪他們玩。學生答錯也沒關係，我笑笑帶過就好。」</w:t>
+        <w:t>「我準備得很充分，今天只要陪他們玩。學生答錯也沒關係，我笑笑帶過就好。慢慢來，我可以的。」</w:t>
       </w:r>
     </w:p>
     <w:tbl>
@@ -73,7 +67,7 @@
       <w:tr>
         <w:tc>
           <w:tcPr>
-            <w:tcW w:type="dxa" w:w="1872"/>
+            <w:tcW w:type="dxa" w:w="1728"/>
             <w:shd w:val="clear" w:color="auto" w:fill="4CAF50"/>
           </w:tcPr>
           <w:p>
@@ -93,7 +87,7 @@
         </w:tc>
         <w:tc>
           <w:tcPr>
-            <w:tcW w:type="dxa" w:w="1728"/>
+            <w:tcW w:type="dxa" w:w="1584"/>
             <w:shd w:val="clear" w:color="auto" w:fill="4CAF50"/>
           </w:tcPr>
           <w:p>
@@ -113,7 +107,7 @@
         </w:tc>
         <w:tc>
           <w:tcPr>
-            <w:tcW w:type="dxa" w:w="4896"/>
+            <w:tcW w:type="dxa" w:w="5616"/>
             <w:shd w:val="clear" w:color="auto" w:fill="4CAF50"/>
           </w:tcPr>
           <w:p>
@@ -127,13 +121,13 @@
                 <w:color w:val="FFFFFF"/>
                 <w:sz w:val="22"/>
               </w:rPr>
-              <w:t>🗣️ 你說（台詞）</w:t>
+              <w:t>🗣️ 你說（完整台詞）</w:t>
             </w:r>
           </w:p>
         </w:tc>
         <w:tc>
           <w:tcPr>
-            <w:tcW w:type="dxa" w:w="2880"/>
+            <w:tcW w:type="dxa" w:w="2448"/>
             <w:shd w:val="clear" w:color="auto" w:fill="4CAF50"/>
           </w:tcPr>
           <w:p>
@@ -155,7 +149,7 @@
       <w:tr>
         <w:tc>
           <w:tcPr>
-            <w:tcW w:type="dxa" w:w="1872"/>
+            <w:tcW w:type="dxa" w:w="1728"/>
             <w:shd w:val="clear" w:color="auto" w:fill="E8F5E9"/>
           </w:tcPr>
           <w:p>
@@ -176,13 +170,13 @@
                 <w:b/>
                 <w:sz w:val="20"/>
               </w:rPr>
-              <w:t>約2分</w:t>
+              <w:t>約3分</w:t>
             </w:r>
           </w:p>
         </w:tc>
         <w:tc>
           <w:tcPr>
-            <w:tcW w:type="dxa" w:w="1728"/>
+            <w:tcW w:type="dxa" w:w="1584"/>
           </w:tcPr>
           <w:p>
             <w:r/>
@@ -192,13 +186,13 @@
                 <w:b w:val="0"/>
                 <w:sz w:val="20"/>
               </w:rPr>
-              <w:t>封面〜冰淇淋學邊界</w:t>
+              <w:t>封面</w:t>
             </w:r>
           </w:p>
         </w:tc>
         <w:tc>
           <w:tcPr>
-            <w:tcW w:type="dxa" w:w="4896"/>
+            <w:tcW w:type="dxa" w:w="5616"/>
           </w:tcPr>
           <w:p>
             <w:r/>
@@ -208,7 +202,7 @@
                 <w:b w:val="0"/>
                 <w:sz w:val="20"/>
               </w:rPr>
-              <w:t>「上課～今天老師帶了祕密武器，等一下請大家吃冰淇淋！🍦 但要先學會一個本領才能吃喔～」</w:t>
+              <w:t>「來～我們上課囉，眼睛看老師這邊。今天老師準備了一個祕密武器喔……（停頓賣關子）等一下我們要——吃冰淇淋！🍦 是不是很開心～」</w:t>
             </w:r>
           </w:p>
           <w:p>
@@ -218,13 +212,23 @@
                 <w:b w:val="0"/>
                 <w:sz w:val="20"/>
               </w:rPr>
-              <w:t>「今天用冰淇淋，學一個詞叫『邊界』。」</w:t>
+              <w:t>「但是！要先學會一個超重要的本領，學會了才可以吃。準備好了嗎？」</w:t>
+            </w:r>
+          </w:p>
+          <w:p>
+            <w:r>
+              <w:rPr>
+                <w:rFonts w:ascii="Microsoft JhengHei" w:hAnsi="Microsoft JhengHei" w:eastAsia="Microsoft JhengHei"/>
+                <w:b w:val="0"/>
+                <w:sz w:val="20"/>
+              </w:rPr>
+              <w:t>「今天我們要用『冰淇淋』，學一個很重要的詞，叫做——『邊界』。邊界就是：每個人身體周圍，有一個看不見的保護圈。」</w:t>
             </w:r>
           </w:p>
         </w:tc>
         <w:tc>
           <w:tcPr>
-            <w:tcW w:type="dxa" w:w="2880"/>
+            <w:tcW w:type="dxa" w:w="2448"/>
           </w:tcPr>
           <w:p>
             <w:r/>
@@ -234,7 +238,26 @@
                 <w:b w:val="0"/>
                 <w:sz w:val="20"/>
               </w:rPr>
-              <w:t>手比圈圈圍住自己</w:t>
+              <w:t>手比一個圈圈圍住自己</w:t>
+            </w:r>
+          </w:p>
+          <w:p>
+            <w:r>
+              <w:rPr>
+                <w:rFonts w:ascii="Microsoft JhengHei" w:hAnsi="Microsoft JhengHei" w:eastAsia="Microsoft JhengHei"/>
+                <w:b w:val="0"/>
+                <w:sz w:val="20"/>
+              </w:rPr>
+            </w:r>
+          </w:p>
+          <w:p>
+            <w:r>
+              <w:rPr>
+                <w:rFonts w:ascii="Microsoft JhengHei" w:hAnsi="Microsoft JhengHei" w:eastAsia="Microsoft JhengHei"/>
+                <w:b w:val="0"/>
+                <w:sz w:val="20"/>
+              </w:rPr>
+              <w:t>語氣期待、賣關子</w:t>
             </w:r>
           </w:p>
         </w:tc>
@@ -242,7 +265,7 @@
       <w:tr>
         <w:tc>
           <w:tcPr>
-            <w:tcW w:type="dxa" w:w="1872"/>
+            <w:tcW w:type="dxa" w:w="1728"/>
             <w:shd w:val="clear" w:color="auto" w:fill="E8F5E9"/>
           </w:tcPr>
           <w:p>
@@ -263,13 +286,13 @@
                 <w:b/>
                 <w:sz w:val="20"/>
               </w:rPr>
-              <w:t>約2分</w:t>
+              <w:t>約3分</w:t>
             </w:r>
           </w:p>
         </w:tc>
         <w:tc>
           <w:tcPr>
-            <w:tcW w:type="dxa" w:w="1728"/>
+            <w:tcW w:type="dxa" w:w="1584"/>
           </w:tcPr>
           <w:p>
             <w:r/>
@@ -285,7 +308,7 @@
         </w:tc>
         <w:tc>
           <w:tcPr>
-            <w:tcW w:type="dxa" w:w="4896"/>
+            <w:tcW w:type="dxa" w:w="5616"/>
           </w:tcPr>
           <w:p>
             <w:r/>
@@ -295,7 +318,7 @@
                 <w:b w:val="0"/>
                 <w:sz w:val="20"/>
               </w:rPr>
-              <w:t>「先看一小段影片，想一個問題：誰可以決定要不要被碰？」</w:t>
+              <w:t>「我們先看一小段影片。看的時候，幫老師注意一個問題：影片裡，誰可以決定『要不要被碰』？記住這個問題喔～」</w:t>
             </w:r>
           </w:p>
           <w:p>
@@ -305,13 +328,13 @@
                 <w:b w:val="0"/>
                 <w:sz w:val="20"/>
               </w:rPr>
-              <w:t>看完問：「誰決定？對～自己！」</w:t>
+              <w:t>（播放後）「好～誰可以決定要不要被碰呀？」（等學生回答）「對！是『自己』！我的身體，我自己決定，好不好？」</w:t>
             </w:r>
           </w:p>
         </w:tc>
         <w:tc>
           <w:tcPr>
-            <w:tcW w:type="dxa" w:w="2880"/>
+            <w:tcW w:type="dxa" w:w="2448"/>
           </w:tcPr>
           <w:p>
             <w:r/>
@@ -321,7 +344,27 @@
                 <w:b w:val="0"/>
                 <w:sz w:val="20"/>
               </w:rPr>
-              <w:t>播影片→提問</w:t>
+              <w:t>播影片</w:t>
+            </w:r>
+          </w:p>
+          <w:p>
+            <w:r>
+              <w:rPr>
+                <w:rFonts w:ascii="Microsoft JhengHei" w:hAnsi="Microsoft JhengHei" w:eastAsia="Microsoft JhengHei"/>
+                <w:b w:val="0"/>
+                <w:sz w:val="20"/>
+              </w:rPr>
+              <w:t>看完提問</w:t>
+            </w:r>
+          </w:p>
+          <w:p>
+            <w:r>
+              <w:rPr>
+                <w:rFonts w:ascii="Microsoft JhengHei" w:hAnsi="Microsoft JhengHei" w:eastAsia="Microsoft JhengHei"/>
+                <w:b w:val="0"/>
+                <w:sz w:val="20"/>
+              </w:rPr>
+              <w:t>等學生回答再揭曉</w:t>
             </w:r>
           </w:p>
         </w:tc>
@@ -329,7 +372,7 @@
       <w:tr>
         <w:tc>
           <w:tcPr>
-            <w:tcW w:type="dxa" w:w="1872"/>
+            <w:tcW w:type="dxa" w:w="1728"/>
             <w:shd w:val="clear" w:color="auto" w:fill="E8F5E9"/>
           </w:tcPr>
           <w:p>
@@ -350,13 +393,13 @@
                 <w:b/>
                 <w:sz w:val="20"/>
               </w:rPr>
-              <w:t>約4分</w:t>
+              <w:t>約5分</w:t>
             </w:r>
           </w:p>
         </w:tc>
         <w:tc>
           <w:tcPr>
-            <w:tcW w:type="dxa" w:w="1728"/>
+            <w:tcW w:type="dxa" w:w="1584"/>
           </w:tcPr>
           <w:p>
             <w:r/>
@@ -372,7 +415,7 @@
         </w:tc>
         <w:tc>
           <w:tcPr>
-            <w:tcW w:type="dxa" w:w="4896"/>
+            <w:tcW w:type="dxa" w:w="5616"/>
           </w:tcPr>
           <w:p>
             <w:r/>
@@ -382,7 +425,7 @@
                 <w:b w:val="0"/>
                 <w:sz w:val="20"/>
               </w:rPr>
-              <w:t>「冰淇淋有三層，像紅綠燈：🟢綠燈＝家人好友可以抱；🟡黃燈＝同學留一個手臂距離；🔴紅燈＝陌生人大聲說不要！」</w:t>
+              <w:t>「看這張圖～冰淇淋有三層，就像紅綠燈，有三種顏色。」</w:t>
             </w:r>
           </w:p>
           <w:p>
@@ -392,13 +435,43 @@
                 <w:b w:val="0"/>
                 <w:sz w:val="20"/>
               </w:rPr>
-              <w:t>「就算綠燈的人，你不想要，也可以說不！」</w:t>
+              <w:t>「🟢綠燈，最裡面，是你最親近最信任的人：爸爸媽媽、阿公阿嬤、最好的朋友。可以抱抱、牽手。」</w:t>
+            </w:r>
+          </w:p>
+          <w:p>
+            <w:r>
+              <w:rPr>
+                <w:rFonts w:ascii="Microsoft JhengHei" w:hAnsi="Microsoft JhengHei" w:eastAsia="Microsoft JhengHei"/>
+                <w:b w:val="0"/>
+                <w:sz w:val="20"/>
+              </w:rPr>
+              <w:t>「🟡黃燈，中間，像同學、認識但不太熟的人。可以靠近，但要留『一個手臂』的距離。（伸手示範）這樣剛剛好。」</w:t>
+            </w:r>
+          </w:p>
+          <w:p>
+            <w:r>
+              <w:rPr>
+                <w:rFonts w:ascii="Microsoft JhengHei" w:hAnsi="Microsoft JhengHei" w:eastAsia="Microsoft JhengHei"/>
+                <w:b w:val="0"/>
+                <w:sz w:val="20"/>
+              </w:rPr>
+              <w:t>「🔴紅燈，最外面，是陌生人、讓你怕怕的人。不可以靠近！要大聲說『不要！』」</w:t>
+            </w:r>
+          </w:p>
+          <w:p>
+            <w:r>
+              <w:rPr>
+                <w:rFonts w:ascii="Microsoft JhengHei" w:hAnsi="Microsoft JhengHei" w:eastAsia="Microsoft JhengHei"/>
+                <w:b w:val="0"/>
+                <w:sz w:val="20"/>
+              </w:rPr>
+              <w:t>「最重要一句話：就算是綠燈的人，如果你今天不想被抱，也可以說『不要』，這是你的權利！」</w:t>
             </w:r>
           </w:p>
         </w:tc>
         <w:tc>
           <w:tcPr>
-            <w:tcW w:type="dxa" w:w="2880"/>
+            <w:tcW w:type="dxa" w:w="2448"/>
           </w:tcPr>
           <w:p>
             <w:r/>
@@ -411,12 +484,31 @@
               <w:t>伸手示範手臂距離</w:t>
             </w:r>
           </w:p>
+          <w:p>
+            <w:r>
+              <w:rPr>
+                <w:rFonts w:ascii="Microsoft JhengHei" w:hAnsi="Microsoft JhengHei" w:eastAsia="Microsoft JhengHei"/>
+                <w:b w:val="0"/>
+                <w:sz w:val="20"/>
+              </w:rPr>
+            </w:r>
+          </w:p>
+          <w:p>
+            <w:r>
+              <w:rPr>
+                <w:rFonts w:ascii="Microsoft JhengHei" w:hAnsi="Microsoft JhengHei" w:eastAsia="Microsoft JhengHei"/>
+                <w:b w:val="0"/>
+                <w:sz w:val="20"/>
+              </w:rPr>
+              <w:t>三種顏色用手勢比</w:t>
+            </w:r>
+          </w:p>
         </w:tc>
       </w:tr>
       <w:tr>
         <w:tc>
           <w:tcPr>
-            <w:tcW w:type="dxa" w:w="1872"/>
+            <w:tcW w:type="dxa" w:w="1728"/>
             <w:shd w:val="clear" w:color="auto" w:fill="E8F5E9"/>
           </w:tcPr>
           <w:p>
@@ -427,7 +519,7 @@
                 <w:b/>
                 <w:sz w:val="20"/>
               </w:rPr>
-              <w:t>④ 等你下課判斷</w:t>
+              <w:t>④ 等你下課</w:t>
             </w:r>
           </w:p>
           <w:p>
@@ -437,13 +529,13 @@
                 <w:b/>
                 <w:sz w:val="20"/>
               </w:rPr>
-              <w:t>約5分</w:t>
+              <w:t>（影片＋題目）約3分</w:t>
             </w:r>
           </w:p>
         </w:tc>
         <w:tc>
           <w:tcPr>
-            <w:tcW w:type="dxa" w:w="1728"/>
+            <w:tcW w:type="dxa" w:w="1584"/>
           </w:tcPr>
           <w:p>
             <w:r/>
@@ -453,13 +545,13 @@
                 <w:b w:val="0"/>
                 <w:sz w:val="20"/>
               </w:rPr>
-              <w:t>影片＋題目／答案頁</w:t>
+              <w:t>影片＋題目頁</w:t>
             </w:r>
           </w:p>
         </w:tc>
         <w:tc>
           <w:tcPr>
-            <w:tcW w:type="dxa" w:w="4896"/>
+            <w:tcW w:type="dxa" w:w="5616"/>
           </w:tcPr>
           <w:p>
             <w:r/>
@@ -469,7 +561,7 @@
                 <w:b w:val="0"/>
                 <w:sz w:val="20"/>
               </w:rPr>
-              <w:t>「放一首你們聽過的歌～周杰倫！邊聽邊想：男生在哪一層？」</w:t>
+              <w:t>「接下來放一首你們一定聽過的歌～周杰倫《等你下課》！邊聽邊想：歌裡的男生，在冰淇淋的哪一層？」</w:t>
             </w:r>
           </w:p>
           <w:p>
@@ -479,7 +571,7 @@
                 <w:b w:val="0"/>
                 <w:sz w:val="20"/>
               </w:rPr>
-              <w:t>（題目頁）「女生不理他，他還一直跟。尊重🟢還是越界🔴？猜猜看！」</w:t>
+              <w:t>（播片段後翻到題目頁）「來看這個畫面：女生轉身走掉、不想理他，男生還一直跟在後面。請問——他是『尊重』🟢還是『越界』🔴？」</w:t>
             </w:r>
           </w:p>
           <w:p>
@@ -489,13 +581,13 @@
                 <w:b w:val="0"/>
                 <w:sz w:val="20"/>
               </w:rPr>
-              <w:t>（按下一頁）「🔴越界＝騷擾！不尊重邊界就是騷擾。」</w:t>
+              <w:t>「綠燈舉這隻手，紅燈舉這隻手，預備～」</w:t>
             </w:r>
           </w:p>
         </w:tc>
         <w:tc>
           <w:tcPr>
-            <w:tcW w:type="dxa" w:w="2880"/>
+            <w:tcW w:type="dxa" w:w="2448"/>
           </w:tcPr>
           <w:p>
             <w:r/>
@@ -515,17 +607,7 @@
                 <w:b w:val="0"/>
                 <w:sz w:val="20"/>
               </w:rPr>
-              <w:t>學生舉手猜</w:t>
-            </w:r>
-          </w:p>
-          <w:p>
-            <w:r>
-              <w:rPr>
-                <w:rFonts w:ascii="Microsoft JhengHei" w:hAnsi="Microsoft JhengHei" w:eastAsia="Microsoft JhengHei"/>
-                <w:b w:val="0"/>
-                <w:sz w:val="20"/>
-              </w:rPr>
-              <w:t>按下一頁揭曉</w:t>
+              <w:t>學生舉手表態</w:t>
             </w:r>
           </w:p>
         </w:tc>
@@ -533,7 +615,7 @@
       <w:tr>
         <w:tc>
           <w:tcPr>
-            <w:tcW w:type="dxa" w:w="1872"/>
+            <w:tcW w:type="dxa" w:w="1728"/>
             <w:shd w:val="clear" w:color="auto" w:fill="E8F5E9"/>
           </w:tcPr>
           <w:p>
@@ -544,7 +626,7 @@
                 <w:b/>
                 <w:sz w:val="20"/>
               </w:rPr>
-              <w:t>⑤ 情境闖關×5</w:t>
+              <w:t>④ 等你下課</w:t>
             </w:r>
           </w:p>
           <w:p>
@@ -554,13 +636,13 @@
                 <w:b/>
                 <w:sz w:val="20"/>
               </w:rPr>
-              <w:t>約10分</w:t>
+              <w:t>（答案）約2分</w:t>
             </w:r>
           </w:p>
         </w:tc>
         <w:tc>
           <w:tcPr>
-            <w:tcW w:type="dxa" w:w="1728"/>
+            <w:tcW w:type="dxa" w:w="1584"/>
           </w:tcPr>
           <w:p>
             <w:r/>
@@ -570,13 +652,13 @@
                 <w:b w:val="0"/>
                 <w:sz w:val="20"/>
               </w:rPr>
-              <w:t>5組題目／答案頁</w:t>
+              <w:t>答案頁〔飛入〕</w:t>
             </w:r>
           </w:p>
         </w:tc>
         <w:tc>
           <w:tcPr>
-            <w:tcW w:type="dxa" w:w="4896"/>
+            <w:tcW w:type="dxa" w:w="5616"/>
           </w:tcPr>
           <w:p>
             <w:r/>
@@ -586,7 +668,7 @@
                 <w:b w:val="0"/>
                 <w:sz w:val="20"/>
               </w:rPr>
-              <w:t>節奏：問→猜→翻頁揭曉→一句重點</w:t>
+              <w:t>「都選好了嗎？看答案囉，三、二、一——」（按下一頁）</w:t>
             </w:r>
           </w:p>
           <w:p>
@@ -596,7 +678,7 @@
                 <w:b w:val="0"/>
                 <w:sz w:val="20"/>
               </w:rPr>
-              <w:t>①同學坐旁邊→🟡黃燈</w:t>
+              <w:t>「🔴答案是『越界』！這個就叫『騷擾』。女生不理他＝把他請出冰淇淋；男生硬跟＝不聽、不尊重。」</w:t>
             </w:r>
           </w:p>
           <w:p>
@@ -606,7 +688,23 @@
                 <w:b w:val="0"/>
                 <w:sz w:val="20"/>
               </w:rPr>
-              <w:t>②有人一直跟→🔴騷擾</w:t>
+              <w:t>「記住：不管他理由是什麼，只要不尊重邊界，就是騷擾。」</w:t>
+            </w:r>
+          </w:p>
+        </w:tc>
+        <w:tc>
+          <w:tcPr>
+            <w:tcW w:type="dxa" w:w="2448"/>
+          </w:tcPr>
+          <w:p>
+            <w:r/>
+            <w:r>
+              <w:rPr>
+                <w:rFonts w:ascii="Microsoft JhengHei" w:hAnsi="Microsoft JhengHei" w:eastAsia="Microsoft JhengHei"/>
+                <w:b w:val="0"/>
+                <w:sz w:val="20"/>
+              </w:rPr>
+              <w:t>倒數後按下一頁</w:t>
             </w:r>
           </w:p>
           <w:p>
@@ -616,53 +714,7 @@
                 <w:b w:val="0"/>
                 <w:sz w:val="20"/>
               </w:rPr>
-              <w:t>③訊息一天一條vs每秒50條→50條＝騷擾</w:t>
-            </w:r>
-          </w:p>
-          <w:p>
-            <w:r>
-              <w:rPr>
-                <w:rFonts w:ascii="Microsoft JhengHei" w:hAnsi="Microsoft JhengHei" w:eastAsia="Microsoft JhengHei"/>
-                <w:b w:val="0"/>
-                <w:sz w:val="20"/>
-              </w:rPr>
-              <w:t>④陌生人靠近→🔴說不要、跑向大人</w:t>
-            </w:r>
-          </w:p>
-          <w:p>
-            <w:r>
-              <w:rPr>
-                <w:rFonts w:ascii="Microsoft JhengHei" w:hAnsi="Microsoft JhengHei" w:eastAsia="Microsoft JhengHei"/>
-                <w:b w:val="0"/>
-                <w:sz w:val="20"/>
-              </w:rPr>
-              <w:t>⑤「再看一眼」看100遍→騷擾要求救</w:t>
-            </w:r>
-          </w:p>
-        </w:tc>
-        <w:tc>
-          <w:tcPr>
-            <w:tcW w:type="dxa" w:w="2880"/>
-          </w:tcPr>
-          <w:p>
-            <w:r/>
-            <w:r>
-              <w:rPr>
-                <w:rFonts w:ascii="Microsoft JhengHei" w:hAnsi="Microsoft JhengHei" w:eastAsia="Microsoft JhengHei"/>
-                <w:b w:val="0"/>
-                <w:sz w:val="20"/>
-              </w:rPr>
-              <w:t>每題按下一頁揭曉</w:t>
-            </w:r>
-          </w:p>
-          <w:p>
-            <w:r>
-              <w:rPr>
-                <w:rFonts w:ascii="Microsoft JhengHei" w:hAnsi="Microsoft JhengHei" w:eastAsia="Microsoft JhengHei"/>
-                <w:b w:val="0"/>
-                <w:sz w:val="20"/>
-              </w:rPr>
-              <w:t>答對說：「太聰明了！拍拍手👏」</w:t>
+              <w:t>答案飛入</w:t>
             </w:r>
           </w:p>
         </w:tc>
@@ -670,7 +722,7 @@
       <w:tr>
         <w:tc>
           <w:tcPr>
-            <w:tcW w:type="dxa" w:w="1872"/>
+            <w:tcW w:type="dxa" w:w="1728"/>
             <w:shd w:val="clear" w:color="auto" w:fill="E8F5E9"/>
           </w:tcPr>
           <w:p>
@@ -681,7 +733,84 @@
                 <w:b/>
                 <w:sz w:val="20"/>
               </w:rPr>
-              <w:t>⑥ 求助5步驟</w:t>
+              <w:t>⑤ 闖關開場</w:t>
+            </w:r>
+          </w:p>
+          <w:p>
+            <w:r>
+              <w:rPr>
+                <w:rFonts w:ascii="Microsoft JhengHei" w:hAnsi="Microsoft JhengHei" w:eastAsia="Microsoft JhengHei"/>
+                <w:b/>
+                <w:sz w:val="20"/>
+              </w:rPr>
+              <w:t>約1分</w:t>
+            </w:r>
+          </w:p>
+        </w:tc>
+        <w:tc>
+          <w:tcPr>
+            <w:tcW w:type="dxa" w:w="1584"/>
+          </w:tcPr>
+          <w:p>
+            <w:r/>
+            <w:r>
+              <w:rPr>
+                <w:rFonts w:ascii="Microsoft JhengHei" w:hAnsi="Microsoft JhengHei" w:eastAsia="Microsoft JhengHei"/>
+                <w:b w:val="0"/>
+                <w:sz w:val="20"/>
+              </w:rPr>
+              <w:t>情境闖關</w:t>
+            </w:r>
+          </w:p>
+        </w:tc>
+        <w:tc>
+          <w:tcPr>
+            <w:tcW w:type="dxa" w:w="5616"/>
+          </w:tcPr>
+          <w:p>
+            <w:r/>
+            <w:r>
+              <w:rPr>
+                <w:rFonts w:ascii="Microsoft JhengHei" w:hAnsi="Microsoft JhengHei" w:eastAsia="Microsoft JhengHei"/>
+                <w:b w:val="0"/>
+                <w:sz w:val="20"/>
+              </w:rPr>
+              <w:t>「現在我們來玩『冰淇淋偵探闖關』！老師出情境，你們來判斷哪一層、該怎麼做。準備好了嗎？」</w:t>
+            </w:r>
+          </w:p>
+        </w:tc>
+        <w:tc>
+          <w:tcPr>
+            <w:tcW w:type="dxa" w:w="2448"/>
+          </w:tcPr>
+          <w:p>
+            <w:r/>
+            <w:r>
+              <w:rPr>
+                <w:rFonts w:ascii="Microsoft JhengHei" w:hAnsi="Microsoft JhengHei" w:eastAsia="Microsoft JhengHei"/>
+                <w:b w:val="0"/>
+                <w:sz w:val="20"/>
+              </w:rPr>
+              <w:t>炒熱氣氛</w:t>
+            </w:r>
+          </w:p>
+        </w:tc>
+      </w:tr>
+      <w:tr>
+        <w:tc>
+          <w:tcPr>
+            <w:tcW w:type="dxa" w:w="1728"/>
+            <w:shd w:val="clear" w:color="auto" w:fill="E8F5E9"/>
+          </w:tcPr>
+          <w:p>
+            <w:r/>
+            <w:r>
+              <w:rPr>
+                <w:rFonts w:ascii="Microsoft JhengHei" w:hAnsi="Microsoft JhengHei" w:eastAsia="Microsoft JhengHei"/>
+                <w:b/>
+                <w:sz w:val="20"/>
+              </w:rPr>
+              <w:t xml:space="preserve">　情境①</w:t>
             </w:r>
           </w:p>
           <w:p>
@@ -697,7 +826,7 @@
         </w:tc>
         <w:tc>
           <w:tcPr>
-            <w:tcW w:type="dxa" w:w="1728"/>
+            <w:tcW w:type="dxa" w:w="1584"/>
           </w:tcPr>
           <w:p>
             <w:r/>
@@ -707,13 +836,13 @@
                 <w:b w:val="0"/>
                 <w:sz w:val="20"/>
               </w:rPr>
-              <w:t>5步驟＋113</w:t>
+              <w:t>題目→答案</w:t>
             </w:r>
           </w:p>
         </w:tc>
         <w:tc>
           <w:tcPr>
-            <w:tcW w:type="dxa" w:w="4896"/>
+            <w:tcW w:type="dxa" w:w="5616"/>
           </w:tcPr>
           <w:p>
             <w:r/>
@@ -723,13 +852,23 @@
                 <w:b w:val="0"/>
                 <w:sz w:val="20"/>
               </w:rPr>
-              <w:t>「有人越過邊界，記住5步驟：認出來→說不要→走開→告訴大人→打113。」</w:t>
+              <w:t>（題目）「情境一！上課時，同學坐在你旁邊。這是哪一層？綠燈、黃燈、還是紅燈？」（等學生猜）</w:t>
+            </w:r>
+          </w:p>
+          <w:p>
+            <w:r>
+              <w:rPr>
+                <w:rFonts w:ascii="Microsoft JhengHei" w:hAnsi="Microsoft JhengHei" w:eastAsia="Microsoft JhengHei"/>
+                <w:b w:val="0"/>
+                <w:sz w:val="20"/>
+              </w:rPr>
+              <w:t>（按下一頁）「🟡黃燈！同學可以靠近，但要留一點距離。如果太近不舒服，可以說什麼？對～『請移開一點』，很棒！」</w:t>
             </w:r>
           </w:p>
         </w:tc>
         <w:tc>
           <w:tcPr>
-            <w:tcW w:type="dxa" w:w="2880"/>
+            <w:tcW w:type="dxa" w:w="2448"/>
           </w:tcPr>
           <w:p>
             <w:r/>
@@ -739,7 +878,17 @@
                 <w:b w:val="0"/>
                 <w:sz w:val="20"/>
               </w:rPr>
-              <w:t>全班一起比手勢念一次</w:t>
+              <w:t>學生猜→翻頁</w:t>
+            </w:r>
+          </w:p>
+          <w:p>
+            <w:r>
+              <w:rPr>
+                <w:rFonts w:ascii="Microsoft JhengHei" w:hAnsi="Microsoft JhengHei" w:eastAsia="Microsoft JhengHei"/>
+                <w:b w:val="0"/>
+                <w:sz w:val="20"/>
+              </w:rPr>
+              <w:t>答對：「太聰明了👏」</w:t>
             </w:r>
           </w:p>
         </w:tc>
@@ -747,7 +896,492 @@
       <w:tr>
         <w:tc>
           <w:tcPr>
-            <w:tcW w:type="dxa" w:w="1872"/>
+            <w:tcW w:type="dxa" w:w="1728"/>
+            <w:shd w:val="clear" w:color="auto" w:fill="E8F5E9"/>
+          </w:tcPr>
+          <w:p>
+            <w:r/>
+            <w:r>
+              <w:rPr>
+                <w:rFonts w:ascii="Microsoft JhengHei" w:hAnsi="Microsoft JhengHei" w:eastAsia="Microsoft JhengHei"/>
+                <w:b/>
+                <w:sz w:val="20"/>
+              </w:rPr>
+              <w:t xml:space="preserve">　情境②</w:t>
+            </w:r>
+          </w:p>
+          <w:p>
+            <w:r>
+              <w:rPr>
+                <w:rFonts w:ascii="Microsoft JhengHei" w:hAnsi="Microsoft JhengHei" w:eastAsia="Microsoft JhengHei"/>
+                <w:b/>
+                <w:sz w:val="20"/>
+              </w:rPr>
+              <w:t>約2分</w:t>
+            </w:r>
+          </w:p>
+        </w:tc>
+        <w:tc>
+          <w:tcPr>
+            <w:tcW w:type="dxa" w:w="1584"/>
+          </w:tcPr>
+          <w:p>
+            <w:r/>
+            <w:r>
+              <w:rPr>
+                <w:rFonts w:ascii="Microsoft JhengHei" w:hAnsi="Microsoft JhengHei" w:eastAsia="Microsoft JhengHei"/>
+                <w:b w:val="0"/>
+                <w:sz w:val="20"/>
+              </w:rPr>
+              <w:t>題目→答案</w:t>
+            </w:r>
+          </w:p>
+        </w:tc>
+        <w:tc>
+          <w:tcPr>
+            <w:tcW w:type="dxa" w:w="5616"/>
+          </w:tcPr>
+          <w:p>
+            <w:r/>
+            <w:r>
+              <w:rPr>
+                <w:rFonts w:ascii="Microsoft JhengHei" w:hAnsi="Microsoft JhengHei" w:eastAsia="Microsoft JhengHei"/>
+                <w:b w:val="0"/>
+                <w:sz w:val="20"/>
+              </w:rPr>
+              <w:t>（題目）「情境二！你已經說『不要跟我』，他還是一直跟。這是？」（等）</w:t>
+            </w:r>
+          </w:p>
+          <w:p>
+            <w:r>
+              <w:rPr>
+                <w:rFonts w:ascii="Microsoft JhengHei" w:hAnsi="Microsoft JhengHei" w:eastAsia="Microsoft JhengHei"/>
+                <w:b w:val="0"/>
+                <w:sz w:val="20"/>
+              </w:rPr>
+              <w:t>（按下一頁）「🔴騷擾！怎麼辦？轉身離開、趕快告訴大人。」</w:t>
+            </w:r>
+          </w:p>
+        </w:tc>
+        <w:tc>
+          <w:tcPr>
+            <w:tcW w:type="dxa" w:w="2448"/>
+          </w:tcPr>
+          <w:p>
+            <w:r/>
+            <w:r>
+              <w:rPr>
+                <w:rFonts w:ascii="Microsoft JhengHei" w:hAnsi="Microsoft JhengHei" w:eastAsia="Microsoft JhengHei"/>
+                <w:b w:val="0"/>
+                <w:sz w:val="20"/>
+              </w:rPr>
+              <w:t>學生猜→翻頁</w:t>
+            </w:r>
+          </w:p>
+        </w:tc>
+      </w:tr>
+      <w:tr>
+        <w:tc>
+          <w:tcPr>
+            <w:tcW w:type="dxa" w:w="1728"/>
+            <w:shd w:val="clear" w:color="auto" w:fill="E8F5E9"/>
+          </w:tcPr>
+          <w:p>
+            <w:r/>
+            <w:r>
+              <w:rPr>
+                <w:rFonts w:ascii="Microsoft JhengHei" w:hAnsi="Microsoft JhengHei" w:eastAsia="Microsoft JhengHei"/>
+                <w:b/>
+                <w:sz w:val="20"/>
+              </w:rPr>
+              <w:t xml:space="preserve">　情境③</w:t>
+            </w:r>
+          </w:p>
+          <w:p>
+            <w:r>
+              <w:rPr>
+                <w:rFonts w:ascii="Microsoft JhengHei" w:hAnsi="Microsoft JhengHei" w:eastAsia="Microsoft JhengHei"/>
+                <w:b/>
+                <w:sz w:val="20"/>
+              </w:rPr>
+              <w:t>約2分</w:t>
+            </w:r>
+          </w:p>
+        </w:tc>
+        <w:tc>
+          <w:tcPr>
+            <w:tcW w:type="dxa" w:w="1584"/>
+          </w:tcPr>
+          <w:p>
+            <w:r/>
+            <w:r>
+              <w:rPr>
+                <w:rFonts w:ascii="Microsoft JhengHei" w:hAnsi="Microsoft JhengHei" w:eastAsia="Microsoft JhengHei"/>
+                <w:b w:val="0"/>
+                <w:sz w:val="20"/>
+              </w:rPr>
+              <w:t>題目→答案</w:t>
+            </w:r>
+          </w:p>
+        </w:tc>
+        <w:tc>
+          <w:tcPr>
+            <w:tcW w:type="dxa" w:w="5616"/>
+          </w:tcPr>
+          <w:p>
+            <w:r/>
+            <w:r>
+              <w:rPr>
+                <w:rFonts w:ascii="Microsoft JhengHei" w:hAnsi="Microsoft JhengHei" w:eastAsia="Microsoft JhengHei"/>
+                <w:b w:val="0"/>
+                <w:sz w:val="20"/>
+              </w:rPr>
+              <w:t>（題目）「情境三！同學傳訊息。一天傳一條，OK嗎？（等）那一秒鐘傳50條呢？」</w:t>
+            </w:r>
+          </w:p>
+          <w:p>
+            <w:r>
+              <w:rPr>
+                <w:rFonts w:ascii="Microsoft JhengHei" w:hAnsi="Microsoft JhengHei" w:eastAsia="Microsoft JhengHei"/>
+                <w:b w:val="0"/>
+                <w:sz w:val="20"/>
+              </w:rPr>
+              <w:t>（按下一頁）「一天一條可以；一秒50條，🔴就是騷擾囉！」</w:t>
+            </w:r>
+          </w:p>
+        </w:tc>
+        <w:tc>
+          <w:tcPr>
+            <w:tcW w:type="dxa" w:w="2448"/>
+          </w:tcPr>
+          <w:p>
+            <w:r/>
+            <w:r>
+              <w:rPr>
+                <w:rFonts w:ascii="Microsoft JhengHei" w:hAnsi="Microsoft JhengHei" w:eastAsia="Microsoft JhengHei"/>
+                <w:b w:val="0"/>
+                <w:sz w:val="20"/>
+              </w:rPr>
+              <w:t>學生猜→翻頁</w:t>
+            </w:r>
+          </w:p>
+        </w:tc>
+      </w:tr>
+      <w:tr>
+        <w:tc>
+          <w:tcPr>
+            <w:tcW w:type="dxa" w:w="1728"/>
+            <w:shd w:val="clear" w:color="auto" w:fill="E8F5E9"/>
+          </w:tcPr>
+          <w:p>
+            <w:r/>
+            <w:r>
+              <w:rPr>
+                <w:rFonts w:ascii="Microsoft JhengHei" w:hAnsi="Microsoft JhengHei" w:eastAsia="Microsoft JhengHei"/>
+                <w:b/>
+                <w:sz w:val="20"/>
+              </w:rPr>
+              <w:t xml:space="preserve">　情境④</w:t>
+            </w:r>
+          </w:p>
+          <w:p>
+            <w:r>
+              <w:rPr>
+                <w:rFonts w:ascii="Microsoft JhengHei" w:hAnsi="Microsoft JhengHei" w:eastAsia="Microsoft JhengHei"/>
+                <w:b/>
+                <w:sz w:val="20"/>
+              </w:rPr>
+              <w:t>約2分</w:t>
+            </w:r>
+          </w:p>
+        </w:tc>
+        <w:tc>
+          <w:tcPr>
+            <w:tcW w:type="dxa" w:w="1584"/>
+          </w:tcPr>
+          <w:p>
+            <w:r/>
+            <w:r>
+              <w:rPr>
+                <w:rFonts w:ascii="Microsoft JhengHei" w:hAnsi="Microsoft JhengHei" w:eastAsia="Microsoft JhengHei"/>
+                <w:b w:val="0"/>
+                <w:sz w:val="20"/>
+              </w:rPr>
+              <w:t>題目→答案</w:t>
+            </w:r>
+          </w:p>
+        </w:tc>
+        <w:tc>
+          <w:tcPr>
+            <w:tcW w:type="dxa" w:w="5616"/>
+          </w:tcPr>
+          <w:p>
+            <w:r/>
+            <w:r>
+              <w:rPr>
+                <w:rFonts w:ascii="Microsoft JhengHei" w:hAnsi="Microsoft JhengHei" w:eastAsia="Microsoft JhengHei"/>
+                <w:b w:val="0"/>
+                <w:sz w:val="20"/>
+              </w:rPr>
+              <w:t>（題目）「情境四！一個陌生人慢慢靠近你。你會怎麼做？」（等）</w:t>
+            </w:r>
+          </w:p>
+          <w:p>
+            <w:r>
+              <w:rPr>
+                <w:rFonts w:ascii="Microsoft JhengHei" w:hAnsi="Microsoft JhengHei" w:eastAsia="Microsoft JhengHei"/>
+                <w:b w:val="0"/>
+                <w:sz w:val="20"/>
+              </w:rPr>
+              <w:t>（按下一頁）「🔴大聲說『不要！』然後趕快跑去找信任的大人。」</w:t>
+            </w:r>
+          </w:p>
+        </w:tc>
+        <w:tc>
+          <w:tcPr>
+            <w:tcW w:type="dxa" w:w="2448"/>
+          </w:tcPr>
+          <w:p>
+            <w:r/>
+            <w:r>
+              <w:rPr>
+                <w:rFonts w:ascii="Microsoft JhengHei" w:hAnsi="Microsoft JhengHei" w:eastAsia="Microsoft JhengHei"/>
+                <w:b w:val="0"/>
+                <w:sz w:val="20"/>
+              </w:rPr>
+              <w:t>學生猜→翻頁</w:t>
+            </w:r>
+          </w:p>
+        </w:tc>
+      </w:tr>
+      <w:tr>
+        <w:tc>
+          <w:tcPr>
+            <w:tcW w:type="dxa" w:w="1728"/>
+            <w:shd w:val="clear" w:color="auto" w:fill="E8F5E9"/>
+          </w:tcPr>
+          <w:p>
+            <w:r/>
+            <w:r>
+              <w:rPr>
+                <w:rFonts w:ascii="Microsoft JhengHei" w:hAnsi="Microsoft JhengHei" w:eastAsia="Microsoft JhengHei"/>
+                <w:b/>
+                <w:sz w:val="20"/>
+              </w:rPr>
+              <w:t xml:space="preserve">　情境⑤</w:t>
+            </w:r>
+          </w:p>
+          <w:p>
+            <w:r>
+              <w:rPr>
+                <w:rFonts w:ascii="Microsoft JhengHei" w:hAnsi="Microsoft JhengHei" w:eastAsia="Microsoft JhengHei"/>
+                <w:b/>
+                <w:sz w:val="20"/>
+              </w:rPr>
+              <w:t>約2分</w:t>
+            </w:r>
+          </w:p>
+        </w:tc>
+        <w:tc>
+          <w:tcPr>
+            <w:tcW w:type="dxa" w:w="1584"/>
+          </w:tcPr>
+          <w:p>
+            <w:r/>
+            <w:r>
+              <w:rPr>
+                <w:rFonts w:ascii="Microsoft JhengHei" w:hAnsi="Microsoft JhengHei" w:eastAsia="Microsoft JhengHei"/>
+                <w:b w:val="0"/>
+                <w:sz w:val="20"/>
+              </w:rPr>
+              <w:t>題目→答案</w:t>
+            </w:r>
+          </w:p>
+        </w:tc>
+        <w:tc>
+          <w:tcPr>
+            <w:tcW w:type="dxa" w:w="5616"/>
+          </w:tcPr>
+          <w:p>
+            <w:r/>
+            <w:r>
+              <w:rPr>
+                <w:rFonts w:ascii="Microsoft JhengHei" w:hAnsi="Microsoft JhengHei" w:eastAsia="Microsoft JhengHei"/>
+                <w:b w:val="0"/>
+                <w:sz w:val="20"/>
+              </w:rPr>
+              <w:t>（題目）「情境五！有人說『再看一眼就走』，結果看了100遍還不走。算不算？」（等）</w:t>
+            </w:r>
+          </w:p>
+          <w:p>
+            <w:r>
+              <w:rPr>
+                <w:rFonts w:ascii="Microsoft JhengHei" w:hAnsi="Microsoft JhengHei" w:eastAsia="Microsoft JhengHei"/>
+                <w:b w:val="0"/>
+                <w:sz w:val="20"/>
+              </w:rPr>
+              <w:t>（按下一頁）「🔴算騷擾！他說謊，又一直不尊重你的邊界。要記得求救！」</w:t>
+            </w:r>
+          </w:p>
+        </w:tc>
+        <w:tc>
+          <w:tcPr>
+            <w:tcW w:type="dxa" w:w="2448"/>
+          </w:tcPr>
+          <w:p>
+            <w:r/>
+            <w:r>
+              <w:rPr>
+                <w:rFonts w:ascii="Microsoft JhengHei" w:hAnsi="Microsoft JhengHei" w:eastAsia="Microsoft JhengHei"/>
+                <w:b w:val="0"/>
+                <w:sz w:val="20"/>
+              </w:rPr>
+              <w:t>學生猜→翻頁</w:t>
+            </w:r>
+          </w:p>
+          <w:p>
+            <w:r>
+              <w:rPr>
+                <w:rFonts w:ascii="Microsoft JhengHei" w:hAnsi="Microsoft JhengHei" w:eastAsia="Microsoft JhengHei"/>
+                <w:b w:val="0"/>
+                <w:sz w:val="20"/>
+              </w:rPr>
+              <w:t>結束時全班鼓掌</w:t>
+            </w:r>
+          </w:p>
+        </w:tc>
+      </w:tr>
+      <w:tr>
+        <w:tc>
+          <w:tcPr>
+            <w:tcW w:type="dxa" w:w="1728"/>
+            <w:shd w:val="clear" w:color="auto" w:fill="E8F5E9"/>
+          </w:tcPr>
+          <w:p>
+            <w:r/>
+            <w:r>
+              <w:rPr>
+                <w:rFonts w:ascii="Microsoft JhengHei" w:hAnsi="Microsoft JhengHei" w:eastAsia="Microsoft JhengHei"/>
+                <w:b/>
+                <w:sz w:val="20"/>
+              </w:rPr>
+              <w:t>⑥ 停・跑・說</w:t>
+            </w:r>
+          </w:p>
+          <w:p>
+            <w:r>
+              <w:rPr>
+                <w:rFonts w:ascii="Microsoft JhengHei" w:hAnsi="Microsoft JhengHei" w:eastAsia="Microsoft JhengHei"/>
+                <w:b/>
+                <w:sz w:val="20"/>
+              </w:rPr>
+              <w:t>約2分</w:t>
+            </w:r>
+          </w:p>
+        </w:tc>
+        <w:tc>
+          <w:tcPr>
+            <w:tcW w:type="dxa" w:w="1584"/>
+          </w:tcPr>
+          <w:p>
+            <w:r/>
+            <w:r>
+              <w:rPr>
+                <w:rFonts w:ascii="Microsoft JhengHei" w:hAnsi="Microsoft JhengHei" w:eastAsia="Microsoft JhengHei"/>
+                <w:b w:val="0"/>
+                <w:sz w:val="20"/>
+              </w:rPr>
+              <w:t>三步驟＋113</w:t>
+            </w:r>
+          </w:p>
+        </w:tc>
+        <w:tc>
+          <w:tcPr>
+            <w:tcW w:type="dxa" w:w="5616"/>
+          </w:tcPr>
+          <w:p>
+            <w:r/>
+            <w:r>
+              <w:rPr>
+                <w:rFonts w:ascii="Microsoft JhengHei" w:hAnsi="Microsoft JhengHei" w:eastAsia="Microsoft JhengHei"/>
+                <w:b w:val="0"/>
+                <w:sz w:val="20"/>
+              </w:rPr>
+              <w:t>「如果真的有人越過你的邊界，老師教你一個超好記的口訣，只有三個字：『停・跑・說』！」</w:t>
+            </w:r>
+          </w:p>
+          <w:p>
+            <w:r>
+              <w:rPr>
+                <w:rFonts w:ascii="Microsoft JhengHei" w:hAnsi="Microsoft JhengHei" w:eastAsia="Microsoft JhengHei"/>
+                <w:b w:val="0"/>
+                <w:sz w:val="20"/>
+              </w:rPr>
+              <w:t>「🛑停——手比出來，大聲說『不要』！」</w:t>
+            </w:r>
+          </w:p>
+          <w:p>
+            <w:r>
+              <w:rPr>
+                <w:rFonts w:ascii="Microsoft JhengHei" w:hAnsi="Microsoft JhengHei" w:eastAsia="Microsoft JhengHei"/>
+                <w:b w:val="0"/>
+                <w:sz w:val="20"/>
+              </w:rPr>
+              <w:t>「🏃跑——趕快離開現場。」</w:t>
+            </w:r>
+          </w:p>
+          <w:p>
+            <w:r>
+              <w:rPr>
+                <w:rFonts w:ascii="Microsoft JhengHei" w:hAnsi="Microsoft JhengHei" w:eastAsia="Microsoft JhengHei"/>
+                <w:b w:val="0"/>
+                <w:sz w:val="20"/>
+              </w:rPr>
+              <w:t>「🗣️說——告訴信任的大人，或打113。」</w:t>
+            </w:r>
+          </w:p>
+          <w:p>
+            <w:r>
+              <w:rPr>
+                <w:rFonts w:ascii="Microsoft JhengHei" w:hAnsi="Microsoft JhengHei" w:eastAsia="Microsoft JhengHei"/>
+                <w:b w:val="0"/>
+                <w:sz w:val="20"/>
+              </w:rPr>
+              <w:t>「來，我們一起做一次：停！跑！說！」</w:t>
+            </w:r>
+          </w:p>
+        </w:tc>
+        <w:tc>
+          <w:tcPr>
+            <w:tcW w:type="dxa" w:w="2448"/>
+          </w:tcPr>
+          <w:p>
+            <w:r/>
+            <w:r>
+              <w:rPr>
+                <w:rFonts w:ascii="Microsoft JhengHei" w:hAnsi="Microsoft JhengHei" w:eastAsia="Microsoft JhengHei"/>
+                <w:b w:val="0"/>
+                <w:sz w:val="20"/>
+              </w:rPr>
+              <w:t>示範三個動作</w:t>
+            </w:r>
+          </w:p>
+          <w:p>
+            <w:r>
+              <w:rPr>
+                <w:rFonts w:ascii="Microsoft JhengHei" w:hAnsi="Microsoft JhengHei" w:eastAsia="Microsoft JhengHei"/>
+                <w:b w:val="0"/>
+                <w:sz w:val="20"/>
+              </w:rPr>
+              <w:t>全班一起做＋喊</w:t>
+            </w:r>
+          </w:p>
+        </w:tc>
+      </w:tr>
+      <w:tr>
+        <w:tc>
+          <w:tcPr>
+            <w:tcW w:type="dxa" w:w="1728"/>
             <w:shd w:val="clear" w:color="auto" w:fill="E8F5E9"/>
           </w:tcPr>
           <w:p>
@@ -774,7 +1408,7 @@
         </w:tc>
         <w:tc>
           <w:tcPr>
-            <w:tcW w:type="dxa" w:w="1728"/>
+            <w:tcW w:type="dxa" w:w="1584"/>
           </w:tcPr>
           <w:p>
             <w:r/>
@@ -790,7 +1424,7 @@
         </w:tc>
         <w:tc>
           <w:tcPr>
-            <w:tcW w:type="dxa" w:w="4896"/>
+            <w:tcW w:type="dxa" w:w="5616"/>
           </w:tcPr>
           <w:p>
             <w:r/>
@@ -800,7 +1434,7 @@
                 <w:b w:val="0"/>
                 <w:sz w:val="20"/>
               </w:rPr>
-              <w:t>「吃冰淇淋時間！黃金規則：想要別人的配料，一定要先問『可以給我一個嗎？』對方說好才能拿。說不要呢？對～我們尊重他！」</w:t>
+              <w:t>「現在～最期待的時間到了，吃冰淇淋！🍦 但有一個『黃金規則』：你只能裝自己的冰淇淋。」</w:t>
             </w:r>
           </w:p>
           <w:p>
@@ -810,13 +1444,33 @@
                 <w:b w:val="0"/>
                 <w:sz w:val="20"/>
               </w:rPr>
-              <w:t>（分享）「誰綠燈最多？誰有紅燈想說說看？」</w:t>
+              <w:t>「如果想要別人的配料，一定要先問：『可以給我一個嗎？』對方說好，才可以拿。」</w:t>
+            </w:r>
+          </w:p>
+          <w:p>
+            <w:r>
+              <w:rPr>
+                <w:rFonts w:ascii="Microsoft JhengHei" w:hAnsi="Microsoft JhengHei" w:eastAsia="Microsoft JhengHei"/>
+                <w:b w:val="0"/>
+                <w:sz w:val="20"/>
+              </w:rPr>
+              <w:t>「如果對方說『不要』呢？（等）對～我們就尊重他，不可以搶！這跟身體一樣，要先問、要尊重。」</w:t>
+            </w:r>
+          </w:p>
+          <w:p>
+            <w:r>
+              <w:rPr>
+                <w:rFonts w:ascii="Microsoft JhengHei" w:hAnsi="Microsoft JhengHei" w:eastAsia="Microsoft JhengHei"/>
+                <w:b w:val="0"/>
+                <w:sz w:val="20"/>
+              </w:rPr>
+              <w:t>（分享時）「來看看你的杯子，誰的綠燈最多呀？哇你今天心情很好～有沒有人紅燈多，想說說看嗎？說出來、找人幫忙，就是最勇敢的！」</w:t>
             </w:r>
           </w:p>
         </w:tc>
         <w:tc>
           <w:tcPr>
-            <w:tcW w:type="dxa" w:w="2880"/>
+            <w:tcW w:type="dxa" w:w="2448"/>
           </w:tcPr>
           <w:p>
             <w:r/>
@@ -836,7 +1490,17 @@
                 <w:b w:val="0"/>
                 <w:sz w:val="20"/>
               </w:rPr>
-              <w:t>巡桌、蓋章、微笑納涼☕</w:t>
+              <w:t>巡桌、蓋章、微笑納涼 ☕</w:t>
+            </w:r>
+          </w:p>
+          <w:p>
+            <w:r>
+              <w:rPr>
+                <w:rFonts w:ascii="Microsoft JhengHei" w:hAnsi="Microsoft JhengHei" w:eastAsia="Microsoft JhengHei"/>
+                <w:b w:val="0"/>
+                <w:sz w:val="20"/>
+              </w:rPr>
+              <w:t>引導分享</w:t>
             </w:r>
           </w:p>
         </w:tc>
@@ -844,7 +1508,7 @@
       <w:tr>
         <w:tc>
           <w:tcPr>
-            <w:tcW w:type="dxa" w:w="1872"/>
+            <w:tcW w:type="dxa" w:w="1728"/>
             <w:shd w:val="clear" w:color="auto" w:fill="E8F5E9"/>
           </w:tcPr>
           <w:p>
@@ -871,7 +1535,7 @@
         </w:tc>
         <w:tc>
           <w:tcPr>
-            <w:tcW w:type="dxa" w:w="1728"/>
+            <w:tcW w:type="dxa" w:w="1584"/>
           </w:tcPr>
           <w:p>
             <w:r/>
@@ -887,7 +1551,7 @@
         </w:tc>
         <w:tc>
           <w:tcPr>
-            <w:tcW w:type="dxa" w:w="4896"/>
+            <w:tcW w:type="dxa" w:w="5616"/>
           </w:tcPr>
           <w:p>
             <w:r/>
@@ -897,7 +1561,7 @@
                 <w:b w:val="0"/>
                 <w:sz w:val="20"/>
               </w:rPr>
-              <w:t>「記得四件事：尊重別人的冰淇淋、保護自己的、勇敢說不、遇到事敢求救。」</w:t>
+              <w:t>「今天學了好多～老師幫大家整理四件最重要的事：第一，尊重別人的冰淇淋；第二，保護自己的冰淇淋；第三，勇敢說『不』；第四，遇到事情敢求救。」</w:t>
             </w:r>
           </w:p>
           <w:p>
@@ -907,13 +1571,33 @@
                 <w:b w:val="0"/>
                 <w:sz w:val="20"/>
               </w:rPr>
-              <w:t>「下課～你們今天超棒！」</w:t>
+              <w:t>「最後，我們一起大聲喊出今天的金句，預備——」</w:t>
+            </w:r>
+          </w:p>
+          <w:p>
+            <w:r>
+              <w:rPr>
+                <w:rFonts w:ascii="Microsoft JhengHei" w:hAnsi="Microsoft JhengHei" w:eastAsia="Microsoft JhengHei"/>
+                <w:b w:val="0"/>
+                <w:sz w:val="20"/>
+              </w:rPr>
+              <w:t>（全班）「我的身體、我的感受，我做主！」</w:t>
+            </w:r>
+          </w:p>
+          <w:p>
+            <w:r>
+              <w:rPr>
+                <w:rFonts w:ascii="Microsoft JhengHei" w:hAnsi="Microsoft JhengHei" w:eastAsia="Microsoft JhengHei"/>
+                <w:b w:val="0"/>
+                <w:sz w:val="20"/>
+              </w:rPr>
+              <w:t>「你們今天真的太棒了！下課～」</w:t>
             </w:r>
           </w:p>
         </w:tc>
         <w:tc>
           <w:tcPr>
-            <w:tcW w:type="dxa" w:w="2880"/>
+            <w:tcW w:type="dxa" w:w="2448"/>
           </w:tcPr>
           <w:p>
             <w:r/>
@@ -923,7 +1607,7 @@
                 <w:b w:val="0"/>
                 <w:sz w:val="20"/>
               </w:rPr>
-              <w:t>全班大聲喊：</w:t>
+              <w:t>全班一起喊金句</w:t>
             </w:r>
           </w:p>
           <w:p>
@@ -933,7 +1617,7 @@
                 <w:b w:val="0"/>
                 <w:sz w:val="20"/>
               </w:rPr>
-              <w:t>「我的身體、我的感受，我做主！」</w:t>
+              <w:t>大力稱讚</w:t>
             </w:r>
           </w:p>
         </w:tc>
@@ -948,7 +1632,7 @@
           <w:color w:val="C0392B"/>
           <w:sz w:val="24"/>
         </w:rPr>
-        <w:t>💪 你只要「問問題＋按下一頁＋發冰淇淋」，其他學生會自己接。穩穩的，加油！</w:t>
+        <w:t>💪 你只要「問問題 → 按下一頁 → 發冰淇淋」，其他學生會自己接。穩穩的，你超有魅力，加油！</w:t>
       </w:r>
     </w:p>
     <w:sectPr>

</xml_diff>

<commit_message>
Add 跟騷法 law segment to Period-3 lesson script
</commit_message>
<xml_diff>
--- a/冰淇淋邊界大冒險_第三節教案逐字稿.docx
+++ b/冰淇淋邊界大冒險_第三節教案逐字稿.docx
@@ -1265,6 +1265,113 @@
                 <w:b/>
                 <w:sz w:val="20"/>
               </w:rPr>
+              <w:t>⑤＋ 法律小結</w:t>
+            </w:r>
+          </w:p>
+          <w:p>
+            <w:r>
+              <w:rPr>
+                <w:rFonts w:ascii="Microsoft JhengHei" w:hAnsi="Microsoft JhengHei" w:eastAsia="Microsoft JhengHei"/>
+                <w:b/>
+                <w:sz w:val="20"/>
+              </w:rPr>
+              <w:t>約2分</w:t>
+            </w:r>
+          </w:p>
+        </w:tc>
+        <w:tc>
+          <w:tcPr>
+            <w:tcW w:type="dxa" w:w="1584"/>
+          </w:tcPr>
+          <w:p>
+            <w:r/>
+            <w:r>
+              <w:rPr>
+                <w:rFonts w:ascii="Microsoft JhengHei" w:hAnsi="Microsoft JhengHei" w:eastAsia="Microsoft JhengHei"/>
+                <w:b w:val="0"/>
+                <w:sz w:val="20"/>
+              </w:rPr>
+              <w:t>法律保護我・跟騷法</w:t>
+            </w:r>
+          </w:p>
+        </w:tc>
+        <w:tc>
+          <w:tcPr>
+            <w:tcW w:type="dxa" w:w="5616"/>
+          </w:tcPr>
+          <w:p>
+            <w:r/>
+            <w:r>
+              <w:rPr>
+                <w:rFonts w:ascii="Microsoft JhengHei" w:hAnsi="Microsoft JhengHei" w:eastAsia="Microsoft JhengHei"/>
+                <w:b w:val="0"/>
+                <w:sz w:val="20"/>
+              </w:rPr>
+              <w:t>「老師補充一件很重要的事：剛剛那些『一直跟、一直看、一直傳訊息』，讓你很害怕的行為，在法律上有一個名字，叫做『跟蹤騷擾』。」</w:t>
+            </w:r>
+          </w:p>
+          <w:p>
+            <w:r>
+              <w:rPr>
+                <w:rFonts w:ascii="Microsoft JhengHei" w:hAnsi="Microsoft JhengHei" w:eastAsia="Microsoft JhengHei"/>
+                <w:b w:val="0"/>
+                <w:sz w:val="20"/>
+              </w:rPr>
+              <w:t>「有一部法律叫《跟騷法》（跟蹤騷擾防制法），就是專門保護你的！如果遇到，可以打110報警，也可以請信任的大人幫忙。」</w:t>
+            </w:r>
+          </w:p>
+          <w:p>
+            <w:r>
+              <w:rPr>
+                <w:rFonts w:ascii="Microsoft JhengHei" w:hAnsi="Microsoft JhengHei" w:eastAsia="Microsoft JhengHei"/>
+                <w:b w:val="0"/>
+                <w:sz w:val="20"/>
+              </w:rPr>
+              <w:t>「記住：法律站在你這邊，你不是孤單一個人。」</w:t>
+            </w:r>
+          </w:p>
+        </w:tc>
+        <w:tc>
+          <w:tcPr>
+            <w:tcW w:type="dxa" w:w="2448"/>
+          </w:tcPr>
+          <w:p>
+            <w:r/>
+            <w:r>
+              <w:rPr>
+                <w:rFonts w:ascii="Microsoft JhengHei" w:hAnsi="Microsoft JhengHei" w:eastAsia="Microsoft JhengHei"/>
+                <w:b w:val="0"/>
+                <w:sz w:val="20"/>
+              </w:rPr>
+              <w:t>〔三行逐項跳出〕</w:t>
+            </w:r>
+          </w:p>
+          <w:p>
+            <w:r>
+              <w:rPr>
+                <w:rFonts w:ascii="Microsoft JhengHei" w:hAnsi="Microsoft JhengHei" w:eastAsia="Microsoft JhengHei"/>
+                <w:b w:val="0"/>
+                <w:sz w:val="20"/>
+              </w:rPr>
+              <w:t>語氣堅定、給安全感</w:t>
+            </w:r>
+          </w:p>
+        </w:tc>
+      </w:tr>
+      <w:tr>
+        <w:tc>
+          <w:tcPr>
+            <w:tcW w:type="dxa" w:w="1728"/>
+            <w:shd w:val="clear" w:color="auto" w:fill="E8F5E9"/>
+          </w:tcPr>
+          <w:p>
+            <w:r/>
+            <w:r>
+              <w:rPr>
+                <w:rFonts w:ascii="Microsoft JhengHei" w:hAnsi="Microsoft JhengHei" w:eastAsia="Microsoft JhengHei"/>
+                <w:b/>
+                <w:sz w:val="20"/>
+              </w:rPr>
               <w:t>⑥ 停・跑・說</w:t>
             </w:r>
           </w:p>

</xml_diff>